<commit_message>
mise à jour config impression
</commit_message>
<xml_diff>
--- a/docs/DEPLOIEMENT.docx
+++ b/docs/DEPLOIEMENT.docx
@@ -833,47 +833,6 @@
               <w:rPr>
                 <w:sz w:val="19"/>
               </w:rPr>
-              <w:t>Page de codes de l'imprimante (D-A2)</w:t>
-            </w:r>
-          </w:p>
-        </w:tc>
-        <w:tc>
-          <w:tcPr>
-            <w:tcW w:type="dxa" w:w="3213"/>
-          </w:tcPr>
-          <w:p>
-            <w:r>
-              <w:rPr>
-                <w:sz w:val="19"/>
-              </w:rPr>
-              <w:t>Accents lisibles sur le ticket</w:t>
-            </w:r>
-          </w:p>
-        </w:tc>
-        <w:tc>
-          <w:tcPr>
-            <w:tcW w:type="dxa" w:w="3213"/>
-          </w:tcPr>
-          <w:p>
-            <w:r>
-              <w:rPr>
-                <w:sz w:val="19"/>
-              </w:rPr>
-              <w:t>Dev A, essai sur le terminal</w:t>
-            </w:r>
-          </w:p>
-        </w:tc>
-      </w:tr>
-      <w:tr>
-        <w:tc>
-          <w:tcPr>
-            <w:tcW w:type="dxa" w:w="3213"/>
-          </w:tcPr>
-          <w:p>
-            <w:r>
-              <w:rPr>
-                <w:sz w:val="19"/>
-              </w:rPr>
               <w:t>Plafond de remise de la caissière (D-A3)</w:t>
             </w:r>
           </w:p>
@@ -1750,7 +1709,126 @@
               <w:rPr>
                 <w:sz w:val="19"/>
               </w:rPr>
-              <w:t>L'application imprime par le spouleur de Windows</w:t>
+              <w:t>Préalable à tout le reste</w:t>
+            </w:r>
+          </w:p>
+        </w:tc>
+      </w:tr>
+      <w:tr>
+        <w:tc>
+          <w:tcPr>
+            <w:tcW w:type="dxa" w:w="3213"/>
+          </w:tcPr>
+          <w:p>
+            <w:r>
+              <w:rPr>
+                <w:b/>
+                <w:sz w:val="19"/>
+              </w:rPr>
+              <w:t>Partage de l'imprimante</w:t>
+            </w:r>
+          </w:p>
+        </w:tc>
+        <w:tc>
+          <w:tcPr>
+            <w:tcW w:type="dxa" w:w="3213"/>
+          </w:tcPr>
+          <w:p>
+            <w:r>
+              <w:rPr>
+                <w:sz w:val="19"/>
+              </w:rPr>
+              <w:t xml:space="preserve">Paramètres › Imprimantes › Xprinter › Propriétés de l'imprimante › onglet </w:t>
+            </w:r>
+            <w:r>
+              <w:rPr>
+                <w:b/>
+                <w:sz w:val="19"/>
+              </w:rPr>
+              <w:t>Partage</w:t>
+            </w:r>
+            <w:r>
+              <w:rPr>
+                <w:sz w:val="19"/>
+              </w:rPr>
+              <w:t xml:space="preserve"> : cocher « Partager cette imprimante », nom du partage </w:t>
+            </w:r>
+            <w:r>
+              <w:rPr>
+                <w:rFonts w:ascii="Consolas" w:hAnsi="Consolas"/>
+                <w:b/>
+                <w:color w:val="13294B"/>
+                <w:sz w:val="19"/>
+              </w:rPr>
+              <w:t>XPOS</w:t>
+            </w:r>
+            <w:r>
+              <w:rPr>
+                <w:sz w:val="19"/>
+              </w:rPr>
+              <w:t xml:space="preserve"> (exactement, sans espace)</w:t>
+            </w:r>
+          </w:p>
+        </w:tc>
+        <w:tc>
+          <w:tcPr>
+            <w:tcW w:type="dxa" w:w="3213"/>
+          </w:tcPr>
+          <w:p>
+            <w:r>
+              <w:rPr>
+                <w:sz w:val="19"/>
+              </w:rPr>
+              <w:t xml:space="preserve">Configuration validée en Phase 0 (D-20) : l'application envoie le ticket vers </w:t>
+            </w:r>
+            <w:r>
+              <w:rPr>
+                <w:rFonts w:ascii="Consolas" w:hAnsi="Consolas"/>
+                <w:color w:val="13294B"/>
+                <w:sz w:val="19"/>
+              </w:rPr>
+              <w:t>\\localhost\XPOS</w:t>
+            </w:r>
+          </w:p>
+        </w:tc>
+      </w:tr>
+      <w:tr>
+        <w:tc>
+          <w:tcPr>
+            <w:tcW w:type="dxa" w:w="3213"/>
+          </w:tcPr>
+          <w:p>
+            <w:r>
+              <w:rPr>
+                <w:sz w:val="19"/>
+              </w:rPr>
+              <w:t>Tiroir-caisse</w:t>
+            </w:r>
+          </w:p>
+        </w:tc>
+        <w:tc>
+          <w:tcPr>
+            <w:tcW w:type="dxa" w:w="3213"/>
+          </w:tcPr>
+          <w:p>
+            <w:r>
+              <w:rPr>
+                <w:sz w:val="19"/>
+              </w:rPr>
+              <w:t>Câble RJ11 branché sur le port tiroir de l'imprimante</w:t>
+            </w:r>
+          </w:p>
+        </w:tc>
+        <w:tc>
+          <w:tcPr>
+            <w:tcW w:type="dxa" w:w="3213"/>
+          </w:tcPr>
+          <w:p>
+            <w:r>
+              <w:rPr>
+                <w:sz w:val="19"/>
+              </w:rPr>
+              <w:t>Le tiroir s'ouvre par l'imprimante</w:t>
             </w:r>
           </w:p>
         </w:tc>
@@ -2267,7 +2345,48 @@
               <w:rPr>
                 <w:sz w:val="19"/>
               </w:rPr>
-              <w:t>Imprimante (méthode, nom), « Imprimer le test » : accents lisibles ; « Ouvrir le tiroir »</w:t>
+              <w:t xml:space="preserve">« Modifier les réglages » : méthode </w:t>
+            </w:r>
+            <w:r>
+              <w:rPr>
+                <w:b/>
+                <w:sz w:val="19"/>
+              </w:rPr>
+              <w:t>Partage réseau</w:t>
+            </w:r>
+            <w:r>
+              <w:rPr>
+                <w:sz w:val="19"/>
+              </w:rPr>
+              <w:t xml:space="preserve">, nom du partage </w:t>
+            </w:r>
+            <w:r>
+              <w:rPr>
+                <w:rFonts w:ascii="Consolas" w:hAnsi="Consolas"/>
+                <w:b/>
+                <w:color w:val="13294B"/>
+                <w:sz w:val="19"/>
+              </w:rPr>
+              <w:t>XPOS</w:t>
+            </w:r>
+            <w:r>
+              <w:rPr>
+                <w:sz w:val="19"/>
+              </w:rPr>
+              <w:t xml:space="preserve">, page de codes </w:t>
+            </w:r>
+            <w:r>
+              <w:rPr>
+                <w:b/>
+                <w:sz w:val="19"/>
+              </w:rPr>
+              <w:t>cp1252</w:t>
+            </w:r>
+            <w:r>
+              <w:rPr>
+                <w:sz w:val="19"/>
+              </w:rPr>
+              <w:t xml:space="preserve"> (valeurs validées, D-20). « Imprimer le test en cp1252 » : « éèêàçùôî ÉÇ € » justes sur le papier ; « Ouvrir le tiroir »</w:t>
             </w:r>
           </w:p>
         </w:tc>
@@ -4434,7 +4553,15 @@
               <w:rPr>
                 <w:sz w:val="19"/>
               </w:rPr>
-              <w:t>Imprimante : méthode et nom</w:t>
+              <w:t xml:space="preserve">Imprimante partagée sous le nom </w:t>
+            </w:r>
+            <w:r>
+              <w:rPr>
+                <w:rFonts w:ascii="Consolas" w:hAnsi="Consolas"/>
+                <w:color w:val="13294B"/>
+                <w:sz w:val="19"/>
+              </w:rPr>
+              <w:t>XPOS</w:t>
             </w:r>
           </w:p>
         </w:tc>
@@ -4442,7 +4569,14 @@
           <w:tcPr>
             <w:tcW w:type="dxa" w:w="4819"/>
           </w:tcPr>
-          <w:p/>
+          <w:p>
+            <w:r>
+              <w:rPr>
+                <w:sz w:val="19"/>
+              </w:rPr>
+              <w:t>☐ oui</w:t>
+            </w:r>
+          </w:p>
         </w:tc>
       </w:tr>
       <w:tr>
@@ -4455,7 +4589,49 @@
               <w:rPr>
                 <w:sz w:val="19"/>
               </w:rPr>
-              <w:t>Page de codes validée (ticket de test lisible)</w:t>
+              <w:t xml:space="preserve">Réglages matériel : Partage réseau · </w:t>
+            </w:r>
+            <w:r>
+              <w:rPr>
+                <w:rFonts w:ascii="Consolas" w:hAnsi="Consolas"/>
+                <w:color w:val="13294B"/>
+                <w:sz w:val="19"/>
+              </w:rPr>
+              <w:t>XPOS</w:t>
+            </w:r>
+            <w:r>
+              <w:rPr>
+                <w:sz w:val="19"/>
+              </w:rPr>
+              <w:t xml:space="preserve"> · cp1252</w:t>
+            </w:r>
+          </w:p>
+        </w:tc>
+        <w:tc>
+          <w:tcPr>
+            <w:tcW w:type="dxa" w:w="4819"/>
+          </w:tcPr>
+          <w:p>
+            <w:r>
+              <w:rPr>
+                <w:sz w:val="19"/>
+              </w:rPr>
+              <w:t>☐ oui</w:t>
+            </w:r>
+          </w:p>
+        </w:tc>
+      </w:tr>
+      <w:tr>
+        <w:tc>
+          <w:tcPr>
+            <w:tcW w:type="dxa" w:w="4819"/>
+          </w:tcPr>
+          <w:p>
+            <w:r>
+              <w:rPr>
+                <w:sz w:val="19"/>
+              </w:rPr>
+              <w:t>Ticket de test : « éèêàçùôî ÉÇ € » justes</w:t>
             </w:r>
           </w:p>
         </w:tc>

</xml_diff>

<commit_message>
docs(sauvegardes): procédure d'essai de restauration sur le terminal (B16)
- fiche docs/fiches-test/ESSAI_RESTAURATION.md (+ .docx) : essai sur une copie de la vraie base,
  repères chiffrés, restauration depuis la liste, la clé USB, à la main, coupures de courant,
  remise en état contrôlée par l'empreinte de la base
- script scripts/lancer-essai-restauration.cmd (POS_DB vers la copie) ; *.cmd en CRLF
- renvois dans DEPLOIEMENT § 8.2, SCENARIOS_TEST PAT-07, fiche administrateur 6.4
- ETAT_AVANCEMENT : libellés du journal ✅ (PR #83), journal des fusions, note B16

Co-Authored-By: Claude Opus 5.5 <noreply@anthropic.com>
</commit_message>
<xml_diff>
--- a/docs/DEPLOIEMENT.docx
+++ b/docs/DEPLOIEMENT.docx
@@ -4203,6 +4203,42 @@
       </w:r>
     </w:p>
     <w:p>
+      <w:r>
+        <w:t xml:space="preserve">Avant la mise en service, cette restauration se répète sur le terminal, </w:t>
+      </w:r>
+      <w:r>
+        <w:rPr>
+          <w:b/>
+        </w:rPr>
+        <w:t>sur une copie</w:t>
+      </w:r>
+      <w:r>
+        <w:t xml:space="preserve"> de la base, avec </w:t>
+      </w:r>
+      <w:r>
+        <w:rPr>
+          <w:rFonts w:ascii="Consolas" w:hAnsi="Consolas"/>
+          <w:color w:val="13294B"/>
+          <w:sz w:val="18"/>
+        </w:rPr>
+        <w:t>docs/fiches-test/ESSAI_RESTAURATION.md</w:t>
+      </w:r>
+      <w:r>
+        <w:t xml:space="preserve"> (script </w:t>
+      </w:r>
+      <w:r>
+        <w:rPr>
+          <w:rFonts w:ascii="Consolas" w:hAnsi="Consolas"/>
+          <w:color w:val="13294B"/>
+          <w:sz w:val="18"/>
+        </w:rPr>
+        <w:t>scripts/lancer-essai-restauration.cmd</w:t>
+      </w:r>
+      <w:r>
+        <w:t>).</w:t>
+      </w:r>
+    </w:p>
+    <w:p>
       <w:pPr>
         <w:pStyle w:val="Heading2"/>
       </w:pPr>

</xml_diff>

<commit_message>
feat(poste): démarrage avec Windows, plein écran, instance unique, Quitter l'application, icône (B-P5)
- paramètre `demarrage_automatique` (admin, oui par défaut, journalisé), appliqué au lancement et à
  chaque changement ; jamais en développement ni sur une base d'essai (POS_DB)
- application installée en plein écran, sans barre de titre ; une seule instance (sauf POS_DB)
- « Quitter l'application » en bas du menu : gérant et admin, confirmation, `fermeture_application`
- icône build/icon.ico (scripts/generer_icone.py), `author` dans package.json
- docs : REGLES_METIER § 1.4 et 13, UI_UX § 5.13, DEPLOIEMENT § 5.6, guides, fiche d'essai de
  restauration (fermer la caisse ouverte avec Windows avant de relancer par le script)

Co-Authored-By: Claude Opus 5.5 <noreply@anthropic.com>
</commit_message>
<xml_diff>
--- a/docs/DEPLOIEMENT.docx
+++ b/docs/DEPLOIEMENT.docx
@@ -928,7 +928,7 @@
               <w:rPr>
                 <w:sz w:val="19"/>
               </w:rPr>
-              <w:t>Pas encore développés (Phase 5) : solution provisoire au § 5.6</w:t>
+              <w:t>En place depuis la version qui suit la 1.0.0-rc.1 (B-P5) : voir § 5.6</w:t>
             </w:r>
           </w:p>
         </w:tc>
@@ -2804,25 +2804,111 @@
         <w:pStyle w:val="Heading2"/>
       </w:pPr>
       <w:r>
-        <w:t>5.6 Démarrage automatique (solution provisoire)</w:t>
+        <w:t>5.6 Démarrage automatique et plein écran</w:t>
       </w:r>
     </w:p>
     <w:p>
       <w:r>
-        <w:t>En attendant le démarrage automatique et le mode kiosque (Phase 5) :</w:t>
+        <w:t>L'application installée (B-P5) :</w:t>
       </w:r>
     </w:p>
     <w:p>
       <w:pPr>
-        <w:pStyle w:val="ListNumber"/>
-        <w:numPr>
-          <w:ilvl w:val="0"/>
-          <w:numId w:val="15"/>
-        </w:numPr>
+        <w:pStyle w:val="ListBullet"/>
         <w:spacing w:after="40"/>
       </w:pPr>
       <w:r>
-        <w:t xml:space="preserve">Windows + R, taper </w:t>
+        <w:rPr>
+          <w:b/>
+        </w:rPr>
+        <w:t>s'ouvre seule au démarrage de Windows</w:t>
+      </w:r>
+      <w:r>
+        <w:t xml:space="preserve"> : rien à faire, c'est le réglage par défaut. Pour l'arrêter, l'administratrice va dans </w:t>
+      </w:r>
+      <w:r>
+        <w:rPr>
+          <w:b/>
+        </w:rPr>
+        <w:t>Paramètres › Ce poste</w:t>
+      </w:r>
+      <w:r>
+        <w:t xml:space="preserve"> ;</w:t>
+      </w:r>
+    </w:p>
+    <w:p>
+      <w:pPr>
+        <w:pStyle w:val="ListBullet"/>
+        <w:spacing w:after="40"/>
+      </w:pPr>
+      <w:r>
+        <w:rPr>
+          <w:b/>
+        </w:rPr>
+        <w:t>occupe tout l'écran</w:t>
+      </w:r>
+      <w:r>
+        <w:t>, sans barre de titre ni croix : la caissière ne peut pas la fermer ou la réduire par erreur ;</w:t>
+      </w:r>
+    </w:p>
+    <w:p>
+      <w:pPr>
+        <w:pStyle w:val="ListBullet"/>
+        <w:spacing w:after="40"/>
+      </w:pPr>
+      <w:r>
+        <w:rPr>
+          <w:b/>
+        </w:rPr>
+        <w:t>ne s'ouvre qu'une fois</w:t>
+      </w:r>
+      <w:r>
+        <w:t xml:space="preserve"> : un double-clic sur l'icône pendant qu'elle tourne ramène simplement la caisse au premier plan.</w:t>
+      </w:r>
+    </w:p>
+    <w:p>
+      <w:r>
+        <w:rPr>
+          <w:b/>
+        </w:rPr>
+        <w:t>Fermer l'application</w:t>
+      </w:r>
+      <w:r>
+        <w:t xml:space="preserve"> (mise à jour, restauration à la main, essai) : se connecter en gérant ou en administratrice, puis </w:t>
+      </w:r>
+      <w:r>
+        <w:rPr>
+          <w:b/>
+        </w:rPr>
+        <w:t>« Quitter l'application »</w:t>
+      </w:r>
+      <w:r>
+        <w:t xml:space="preserve"> en bas du menu. Sans compte sous la main, le technicien ferme avec </w:t>
+      </w:r>
+      <w:r>
+        <w:rPr>
+          <w:b/>
+        </w:rPr>
+        <w:t>Alt+F4</w:t>
+      </w:r>
+      <w:r>
+        <w:t>.</w:t>
+      </w:r>
+    </w:p>
+    <w:p>
+      <w:r>
+        <w:t>Contrôle à l'installation : redémarrer le terminal, l'application doit s'ouvrir seule, en plein écran, avec l'écran client sur le 11,6″.</w:t>
+      </w:r>
+    </w:p>
+    <w:p>
+      <w:r>
+        <w:rPr>
+          <w:b/>
+        </w:rPr>
+        <w:t>Terminal installé avec la 1.0.0-rc.1</w:t>
+      </w:r>
+      <w:r>
+        <w:t xml:space="preserve"> : un raccourci avait été mis à la main dans le dossier de démarrage de Windows (Windows + R, </w:t>
       </w:r>
       <w:r>
         <w:rPr>
@@ -2833,33 +2919,16 @@
         <w:t>shell:startup</w:t>
       </w:r>
       <w:r>
-        <w:t>, Entrée.</w:t>
-      </w:r>
-    </w:p>
-    <w:p>
-      <w:pPr>
-        <w:pStyle w:val="ListNumber"/>
-        <w:numPr>
-          <w:ilvl w:val="0"/>
-          <w:numId w:val="15"/>
-        </w:numPr>
-        <w:spacing w:after="40"/>
-      </w:pPr>
-      <w:r>
-        <w:t>Y copier le raccourci « Ma Boutique POS » du bureau.</w:t>
-      </w:r>
-    </w:p>
-    <w:p>
-      <w:pPr>
-        <w:pStyle w:val="ListNumber"/>
-        <w:numPr>
-          <w:ilvl w:val="0"/>
-          <w:numId w:val="15"/>
-        </w:numPr>
-        <w:spacing w:after="40"/>
-      </w:pPr>
-      <w:r>
-        <w:t>Redémarrer le terminal : l'application doit s'ouvrir seule.</w:t>
+        <w:t xml:space="preserve">). Après la mise à jour, </w:t>
+      </w:r>
+      <w:r>
+        <w:rPr>
+          <w:b/>
+        </w:rPr>
+        <w:t>l'effacer</w:t>
+      </w:r>
+      <w:r>
+        <w:t xml:space="preserve"> : il ferait double emploi (sans danger, l'application ne s'ouvre qu'une fois, mais inutile).</w:t>
       </w:r>
     </w:p>
     <w:p>
@@ -3331,7 +3400,7 @@
         <w:pStyle w:val="ListNumber"/>
         <w:numPr>
           <w:ilvl w:val="0"/>
-          <w:numId w:val="16"/>
+          <w:numId w:val="15"/>
         </w:numPr>
         <w:spacing w:after="40"/>
       </w:pPr>
@@ -3364,7 +3433,7 @@
         <w:pStyle w:val="ListNumber"/>
         <w:numPr>
           <w:ilvl w:val="0"/>
-          <w:numId w:val="16"/>
+          <w:numId w:val="15"/>
         </w:numPr>
         <w:spacing w:after="40"/>
       </w:pPr>
@@ -3388,7 +3457,7 @@
         <w:pStyle w:val="ListNumber"/>
         <w:numPr>
           <w:ilvl w:val="0"/>
-          <w:numId w:val="16"/>
+          <w:numId w:val="15"/>
         </w:numPr>
         <w:spacing w:after="40"/>
       </w:pPr>
@@ -3437,6 +3506,101 @@
       <w:pPr>
         <w:spacing w:after="40"/>
       </w:pPr>
+    </w:p>
+    <w:p>
+      <w:pPr>
+        <w:pStyle w:val="ListNumber"/>
+        <w:numPr>
+          <w:ilvl w:val="0"/>
+          <w:numId w:val="15"/>
+        </w:numPr>
+        <w:spacing w:after="40"/>
+      </w:pPr>
+      <w:r>
+        <w:t>Vérifier :</w:t>
+      </w:r>
+    </w:p>
+    <w:p>
+      <w:pPr>
+        <w:pStyle w:val="ListBullet2"/>
+        <w:spacing w:after="40"/>
+      </w:pPr>
+      <w:r>
+        <w:t>☐ l'application démarre sans message « Démarrage impossible » ;</w:t>
+      </w:r>
+    </w:p>
+    <w:p>
+      <w:pPr>
+        <w:pStyle w:val="ListBullet2"/>
+        <w:spacing w:after="40"/>
+      </w:pPr>
+      <w:r>
+        <w:t xml:space="preserve">☐ une sauvegarde « Avant une mise à jour » est apparue dans </w:t>
+      </w:r>
+      <w:r>
+        <w:rPr>
+          <w:rFonts w:ascii="Consolas" w:hAnsi="Consolas"/>
+          <w:color w:val="13294B"/>
+          <w:sz w:val="18"/>
+        </w:rPr>
+        <w:t>C:\Repetition\sauvegardes</w:t>
+      </w:r>
+      <w:r>
+        <w:t xml:space="preserve"> ;</w:t>
+      </w:r>
+    </w:p>
+    <w:p>
+      <w:pPr>
+        <w:pStyle w:val="ListBullet2"/>
+        <w:spacing w:after="40"/>
+      </w:pPr>
+      <w:r>
+        <w:t>☐ les chiffres n'ont pas bougé : valeur du stock (écran Stock), total dû aux fournisseurs, nombre de produits, dernières ventes, dernier Z ;</w:t>
+      </w:r>
+    </w:p>
+    <w:p>
+      <w:pPr>
+        <w:pStyle w:val="ListBullet2"/>
+        <w:spacing w:after="40"/>
+      </w:pPr>
+      <w:r>
+        <w:t>☐ les nouvelles fonctions marchent sur ces données réelles.</w:t>
+      </w:r>
+    </w:p>
+    <w:p>
+      <w:pPr>
+        <w:pStyle w:val="ListNumber"/>
+        <w:numPr>
+          <w:ilvl w:val="0"/>
+          <w:numId w:val="15"/>
+        </w:numPr>
+        <w:spacing w:after="40"/>
+      </w:pPr>
+      <w:r>
+        <w:t>Effacer la copie ensuite : elle contient les données de la cliente.</w:t>
+      </w:r>
+    </w:p>
+    <w:p>
+      <w:pPr>
+        <w:pStyle w:val="Heading2"/>
+      </w:pPr>
+      <w:r>
+        <w:t>6.3 Mise à jour sur le terminal</w:t>
+      </w:r>
+    </w:p>
+    <w:p>
+      <w:r>
+        <w:t xml:space="preserve">Choisir un moment </w:t>
+      </w:r>
+      <w:r>
+        <w:rPr>
+          <w:b/>
+        </w:rPr>
+        <w:t>sans client</w:t>
+      </w:r>
+      <w:r>
+        <w:t xml:space="preserve"> : après la clôture du soir, ou avant l'ouverture.</w:t>
+      </w:r>
     </w:p>
     <w:p>
       <w:pPr>
@@ -3448,54 +3612,13 @@
         <w:spacing w:after="40"/>
       </w:pPr>
       <w:r>
-        <w:t>Vérifier :</w:t>
-      </w:r>
-    </w:p>
-    <w:p>
-      <w:pPr>
-        <w:pStyle w:val="ListBullet2"/>
-        <w:spacing w:after="40"/>
-      </w:pPr>
-      <w:r>
-        <w:t>☐ l'application démarre sans message « Démarrage impossible » ;</w:t>
-      </w:r>
-    </w:p>
-    <w:p>
-      <w:pPr>
-        <w:pStyle w:val="ListBullet2"/>
-        <w:spacing w:after="40"/>
-      </w:pPr>
-      <w:r>
-        <w:t xml:space="preserve">☐ une sauvegarde « Avant une mise à jour » est apparue dans </w:t>
-      </w:r>
-      <w:r>
         <w:rPr>
-          <w:rFonts w:ascii="Consolas" w:hAnsi="Consolas"/>
-          <w:color w:val="13294B"/>
-          <w:sz w:val="18"/>
+          <w:b/>
         </w:rPr>
-        <w:t>C:\Repetition\sauvegardes</w:t>
-      </w:r>
-      <w:r>
-        <w:t xml:space="preserve"> ;</w:t>
-      </w:r>
-    </w:p>
-    <w:p>
-      <w:pPr>
-        <w:pStyle w:val="ListBullet2"/>
-        <w:spacing w:after="40"/>
-      </w:pPr>
-      <w:r>
-        <w:t>☐ les chiffres n'ont pas bougé : valeur du stock (écran Stock), total dû aux fournisseurs, nombre de produits, dernières ventes, dernier Z ;</w:t>
-      </w:r>
-    </w:p>
-    <w:p>
-      <w:pPr>
-        <w:pStyle w:val="ListBullet2"/>
-        <w:spacing w:after="40"/>
-      </w:pPr>
-      <w:r>
-        <w:t>☐ les nouvelles fonctions marchent sur ces données réelles.</w:t>
+        <w:t>Toutes les caisses sont clôturées</w:t>
+      </w:r>
+      <w:r>
+        <w:t xml:space="preserve"> (écran Clôture de caisse : aucune caisse ouverte).</w:t>
       </w:r>
     </w:p>
     <w:p>
@@ -3508,29 +3631,230 @@
         <w:spacing w:after="40"/>
       </w:pPr>
       <w:r>
-        <w:t>Effacer la copie ensuite : elle contient les données de la cliente.</w:t>
-      </w:r>
-    </w:p>
-    <w:p>
-      <w:pPr>
-        <w:pStyle w:val="Heading2"/>
-      </w:pPr>
-      <w:r>
-        <w:t>6.3 Mise à jour sur le terminal</w:t>
-      </w:r>
-    </w:p>
-    <w:p>
-      <w:r>
-        <w:t xml:space="preserve">Choisir un moment </w:t>
+        <w:t xml:space="preserve">Écran </w:t>
       </w:r>
       <w:r>
         <w:rPr>
           <w:b/>
         </w:rPr>
-        <w:t>sans client</w:t>
-      </w:r>
-      <w:r>
-        <w:t xml:space="preserve"> : après la clôture du soir, ou avant l'ouverture.</w:t>
+        <w:t>Sauvegardes</w:t>
+      </w:r>
+      <w:r>
+        <w:t xml:space="preserve"> : « Sauvegarder maintenant », vérifier qu'elle est aussi sur la clé USB.</w:t>
+      </w:r>
+    </w:p>
+    <w:p>
+      <w:pPr>
+        <w:pStyle w:val="ListNumber"/>
+        <w:numPr>
+          <w:ilvl w:val="0"/>
+          <w:numId w:val="16"/>
+        </w:numPr>
+        <w:spacing w:after="40"/>
+      </w:pPr>
+      <w:r>
+        <w:rPr>
+          <w:b/>
+        </w:rPr>
+        <w:t>Fermer l'application</w:t>
+      </w:r>
+      <w:r>
+        <w:t xml:space="preserve"> (« Quitter l'application » en bas du menu, § 5.6).</w:t>
+      </w:r>
+    </w:p>
+    <w:p>
+      <w:pPr>
+        <w:pStyle w:val="ListNumber"/>
+        <w:numPr>
+          <w:ilvl w:val="0"/>
+          <w:numId w:val="16"/>
+        </w:numPr>
+        <w:spacing w:after="40"/>
+      </w:pPr>
+      <w:r>
+        <w:t>Copie de sécurité supplémentaire : copier le dossier de données complet (</w:t>
+      </w:r>
+      <w:r>
+        <w:rPr>
+          <w:rFonts w:ascii="Consolas" w:hAnsi="Consolas"/>
+          <w:color w:val="13294B"/>
+          <w:sz w:val="18"/>
+        </w:rPr>
+        <w:t>%APPDATA%\&lt;dossier&gt;</w:t>
+      </w:r>
+      <w:r>
+        <w:t xml:space="preserve">) sur la clé USB, dans un dossier </w:t>
+      </w:r>
+      <w:r>
+        <w:rPr>
+          <w:rFonts w:ascii="Consolas" w:hAnsi="Consolas"/>
+          <w:color w:val="13294B"/>
+          <w:sz w:val="18"/>
+        </w:rPr>
+        <w:t>Avant_maj_1.0.1_AAAA-MM-JJ</w:t>
+      </w:r>
+      <w:r>
+        <w:t>.</w:t>
+      </w:r>
+    </w:p>
+    <w:p>
+      <w:pPr>
+        <w:pStyle w:val="ListNumber"/>
+        <w:numPr>
+          <w:ilvl w:val="0"/>
+          <w:numId w:val="16"/>
+        </w:numPr>
+        <w:spacing w:after="40"/>
+      </w:pPr>
+      <w:r>
+        <w:t xml:space="preserve">Lancer le nouvel installateur </w:t>
+      </w:r>
+      <w:r>
+        <w:rPr>
+          <w:rFonts w:ascii="Consolas" w:hAnsi="Consolas"/>
+          <w:color w:val="13294B"/>
+          <w:sz w:val="18"/>
+        </w:rPr>
+        <w:t>Ma Boutique POS Setup 1.0.1.exe</w:t>
+      </w:r>
+      <w:r>
+        <w:t xml:space="preserve"> (même procédure qu'au § 5.2). Il remplace l'application ; </w:t>
+      </w:r>
+      <w:r>
+        <w:rPr>
+          <w:b/>
+        </w:rPr>
+        <w:t>la base n'est pas touchée</w:t>
+      </w:r>
+      <w:r>
+        <w:t xml:space="preserve"> par l'installateur.</w:t>
+      </w:r>
+    </w:p>
+    <w:p>
+      <w:pPr>
+        <w:pStyle w:val="ListNumber"/>
+        <w:numPr>
+          <w:ilvl w:val="0"/>
+          <w:numId w:val="16"/>
+        </w:numPr>
+        <w:spacing w:after="40"/>
+      </w:pPr>
+      <w:r>
+        <w:t>L'application démarre : elle sauvegarde la base (« Avant une mise à jour »), puis applique les migrations.</w:t>
+      </w:r>
+    </w:p>
+    <w:p>
+      <w:pPr>
+        <w:pStyle w:val="ListNumber"/>
+        <w:numPr>
+          <w:ilvl w:val="0"/>
+          <w:numId w:val="16"/>
+        </w:numPr>
+        <w:spacing w:after="40"/>
+      </w:pPr>
+      <w:r>
+        <w:t>Vérifications :</w:t>
+      </w:r>
+    </w:p>
+    <w:p>
+      <w:pPr>
+        <w:pStyle w:val="ListBullet2"/>
+        <w:spacing w:after="40"/>
+      </w:pPr>
+      <w:r>
+        <w:t>☐ connexion de l'administratrice ;</w:t>
+      </w:r>
+    </w:p>
+    <w:p>
+      <w:pPr>
+        <w:pStyle w:val="ListBullet2"/>
+        <w:spacing w:after="40"/>
+      </w:pPr>
+      <w:r>
+        <w:t>☐ écran Sauvegardes : une sauvegarde « Avant une mise à jour » toute récente ;</w:t>
+      </w:r>
+    </w:p>
+    <w:p>
+      <w:pPr>
+        <w:pStyle w:val="ListBullet2"/>
+        <w:spacing w:after="40"/>
+      </w:pPr>
+      <w:r>
+        <w:t>☐ Stock : même valeur totale qu'avant la mise à jour ;</w:t>
+      </w:r>
+    </w:p>
+    <w:p>
+      <w:pPr>
+        <w:pStyle w:val="ListBullet2"/>
+        <w:spacing w:after="40"/>
+      </w:pPr>
+      <w:r>
+        <w:t>☐ Fournisseurs : même total dû ;</w:t>
+      </w:r>
+    </w:p>
+    <w:p>
+      <w:pPr>
+        <w:pStyle w:val="ListBullet2"/>
+        <w:spacing w:after="40"/>
+      </w:pPr>
+      <w:r>
+        <w:t>☐ Réglages matériel : ticket de test imprimé ;</w:t>
+      </w:r>
+    </w:p>
+    <w:p>
+      <w:pPr>
+        <w:pStyle w:val="ListBullet2"/>
+        <w:spacing w:after="40"/>
+      </w:pPr>
+      <w:r>
+        <w:t>☐ les nouveautés de la version, montrées à la cliente.</w:t>
+      </w:r>
+    </w:p>
+    <w:p>
+      <w:pPr>
+        <w:pStyle w:val="ListNumber"/>
+        <w:numPr>
+          <w:ilvl w:val="0"/>
+          <w:numId w:val="16"/>
+        </w:numPr>
+        <w:spacing w:after="40"/>
+      </w:pPr>
+      <w:r>
+        <w:t>Noter la mise à jour sur la fiche de suivi (annexe B).</w:t>
+      </w:r>
+    </w:p>
+    <w:p>
+      <w:pPr>
+        <w:pStyle w:val="Heading2"/>
+      </w:pPr>
+      <w:r>
+        <w:t>6.4 Mise à jour sans migration</w:t>
+      </w:r>
+    </w:p>
+    <w:p>
+      <w:r>
+        <w:t>Même procédure (étapes 1 à 8). Il n'y aura simplement pas de sauvegarde « Avant une mise à jour » à l'étape 6 : c'est normal.</w:t>
+      </w:r>
+    </w:p>
+    <w:p>
+      <w:pPr>
+        <w:pStyle w:val="Heading1"/>
+      </w:pPr>
+      <w:r>
+        <w:t>7. Retour arrière (si la mise à jour se passe mal)</w:t>
+      </w:r>
+    </w:p>
+    <w:p>
+      <w:pPr>
+        <w:pStyle w:val="Heading2"/>
+      </w:pPr>
+      <w:r>
+        <w:t>7.1 L'application ne démarre plus après la mise à jour</w:t>
+      </w:r>
+    </w:p>
+    <w:p>
+      <w:r>
+        <w:t>Message « Démarrage impossible » : la migration en échec a été annulée (tout ou rien), mais celles qui la précédaient dans la même mise à jour sont restées appliquées. On revient donc à la base d'avant la mise à jour :</w:t>
       </w:r>
     </w:p>
     <w:p>
@@ -3543,13 +3867,7 @@
         <w:spacing w:after="40"/>
       </w:pPr>
       <w:r>
-        <w:rPr>
-          <w:b/>
-        </w:rPr>
-        <w:t>Toutes les caisses sont clôturées</w:t>
-      </w:r>
-      <w:r>
-        <w:t xml:space="preserve"> (écran Clôture de caisse : aucune caisse ouverte).</w:t>
+        <w:t>Noter le message exact (photo) et le transmettre aux développeurs.</w:t>
       </w:r>
     </w:p>
     <w:p>
@@ -3562,16 +3880,27 @@
         <w:spacing w:after="40"/>
       </w:pPr>
       <w:r>
-        <w:t xml:space="preserve">Écran </w:t>
+        <w:t xml:space="preserve">Réinstaller </w:t>
       </w:r>
       <w:r>
         <w:rPr>
           <w:b/>
         </w:rPr>
-        <w:t>Sauvegardes</w:t>
-      </w:r>
-      <w:r>
-        <w:t xml:space="preserve"> : « Sauvegarder maintenant », vérifier qu'elle est aussi sur la clé USB.</w:t>
+        <w:t>la version précédente</w:t>
+      </w:r>
+      <w:r>
+        <w:t xml:space="preserve"> (</w:t>
+      </w:r>
+      <w:r>
+        <w:rPr>
+          <w:rFonts w:ascii="Consolas" w:hAnsi="Consolas"/>
+          <w:color w:val="13294B"/>
+          <w:sz w:val="18"/>
+        </w:rPr>
+        <w:t>Setup 1.0.0.exe</w:t>
+      </w:r>
+      <w:r>
+        <w:t>, gardé sur la clé).</w:t>
       </w:r>
     </w:p>
     <w:p>
@@ -3584,10 +3913,16 @@
         <w:spacing w:after="40"/>
       </w:pPr>
       <w:r>
+        <w:t xml:space="preserve">Remettre la base d'avant la mise à jour par la </w:t>
+      </w:r>
+      <w:r>
         <w:rPr>
           <w:b/>
         </w:rPr>
-        <w:t>Fermer l'application.</w:t>
+        <w:t>restauration manuelle</w:t>
+      </w:r>
+      <w:r>
+        <w:t xml:space="preserve"> (§ 7.3), avec la sauvegarde « Avant une mise à jour » (ou la copie de l'étape 4 du § 6.3).</w:t>
       </w:r>
     </w:p>
     <w:p>
@@ -3600,7 +3935,117 @@
         <w:spacing w:after="40"/>
       </w:pPr>
       <w:r>
-        <w:t>Copie de sécurité supplémentaire : copier le dossier de données complet (</w:t>
+        <w:t>La boutique peut revendre. Les développeurs corrigent la migration, refont la répétition générale (§ 6.2), puis une nouvelle mise à jour.</w:t>
+      </w:r>
+    </w:p>
+    <w:p>
+      <w:pPr>
+        <w:pStyle w:val="Heading2"/>
+      </w:pPr>
+      <w:r>
+        <w:t>7.2 L'application démarre mais les données semblent fausses</w:t>
+      </w:r>
+    </w:p>
+    <w:p>
+      <w:pPr>
+        <w:pStyle w:val="ListNumber"/>
+        <w:numPr>
+          <w:ilvl w:val="0"/>
+          <w:numId w:val="18"/>
+        </w:numPr>
+        <w:spacing w:after="40"/>
+      </w:pPr>
+      <w:r>
+        <w:rPr>
+          <w:b/>
+        </w:rPr>
+        <w:t>Arrêter tout de suite</w:t>
+      </w:r>
+      <w:r>
+        <w:t xml:space="preserve"> de vendre sur cette version.</w:t>
+      </w:r>
+    </w:p>
+    <w:p>
+      <w:pPr>
+        <w:pStyle w:val="ListNumber"/>
+        <w:numPr>
+          <w:ilvl w:val="0"/>
+          <w:numId w:val="18"/>
+        </w:numPr>
+        <w:spacing w:after="40"/>
+      </w:pPr>
+      <w:r>
+        <w:t>Réinstaller la version précédente.</w:t>
+      </w:r>
+    </w:p>
+    <w:p>
+      <w:pPr>
+        <w:pStyle w:val="ListNumber"/>
+        <w:numPr>
+          <w:ilvl w:val="0"/>
+          <w:numId w:val="18"/>
+        </w:numPr>
+        <w:spacing w:after="40"/>
+      </w:pPr>
+      <w:r>
+        <w:t xml:space="preserve">Restaurer la sauvegarde « Avant une mise à jour » (§ 8.2) : elle date d'avant les migrations, donc l'ancienne version l'accepte. </w:t>
+      </w:r>
+      <w:r>
+        <w:rPr>
+          <w:b/>
+        </w:rPr>
+        <w:t>Tout ce qui a été saisi après la mise à jour est perdu</w:t>
+      </w:r>
+      <w:r>
+        <w:t xml:space="preserve"> : c'est pourquoi les vérifications du § 6.3 se font avant de rouvrir la caisse.</w:t>
+      </w:r>
+    </w:p>
+    <w:p>
+      <w:r>
+        <w:t xml:space="preserve">Une sauvegarde faite par une version </w:t>
+      </w:r>
+      <w:r>
+        <w:rPr>
+          <w:b/>
+        </w:rPr>
+        <w:t>plus récente</w:t>
+      </w:r>
+      <w:r>
+        <w:t xml:space="preserve"> est refusée par une version plus ancienne (migration inconnue) : c'est voulu, pour ne jamais ouvrir une base avec un code qui ne la comprend pas.</w:t>
+      </w:r>
+    </w:p>
+    <w:p>
+      <w:pPr>
+        <w:pStyle w:val="Heading2"/>
+      </w:pPr>
+      <w:r>
+        <w:t>7.3 Restauration manuelle (quand l'application ne démarre pas)</w:t>
+      </w:r>
+    </w:p>
+    <w:p>
+      <w:pPr>
+        <w:pStyle w:val="ListNumber"/>
+        <w:numPr>
+          <w:ilvl w:val="0"/>
+          <w:numId w:val="19"/>
+        </w:numPr>
+        <w:spacing w:after="40"/>
+      </w:pPr>
+      <w:r>
+        <w:t>Fermer l'application (« Quitter l'application », sinon Alt+F4 ; vérifier dans le Gestionnaire des tâches qu'elle ne tourne plus).</w:t>
+      </w:r>
+    </w:p>
+    <w:p>
+      <w:pPr>
+        <w:pStyle w:val="ListNumber"/>
+        <w:numPr>
+          <w:ilvl w:val="0"/>
+          <w:numId w:val="19"/>
+        </w:numPr>
+        <w:spacing w:after="40"/>
+      </w:pPr>
+      <w:r>
+        <w:t>Ouvrir le dossier de données (</w:t>
       </w:r>
       <w:r>
         <w:rPr>
@@ -3611,267 +4056,7 @@
         <w:t>%APPDATA%\&lt;dossier&gt;</w:t>
       </w:r>
       <w:r>
-        <w:t xml:space="preserve">) sur la clé USB, dans un dossier </w:t>
-      </w:r>
-      <w:r>
-        <w:rPr>
-          <w:rFonts w:ascii="Consolas" w:hAnsi="Consolas"/>
-          <w:color w:val="13294B"/>
-          <w:sz w:val="18"/>
-        </w:rPr>
-        <w:t>Avant_maj_1.0.1_AAAA-MM-JJ</w:t>
-      </w:r>
-      <w:r>
-        <w:t>.</w:t>
-      </w:r>
-    </w:p>
-    <w:p>
-      <w:pPr>
-        <w:pStyle w:val="ListNumber"/>
-        <w:numPr>
-          <w:ilvl w:val="0"/>
-          <w:numId w:val="17"/>
-        </w:numPr>
-        <w:spacing w:after="40"/>
-      </w:pPr>
-      <w:r>
-        <w:t xml:space="preserve">Lancer le nouvel installateur </w:t>
-      </w:r>
-      <w:r>
-        <w:rPr>
-          <w:rFonts w:ascii="Consolas" w:hAnsi="Consolas"/>
-          <w:color w:val="13294B"/>
-          <w:sz w:val="18"/>
-        </w:rPr>
-        <w:t>Ma Boutique POS Setup 1.0.1.exe</w:t>
-      </w:r>
-      <w:r>
-        <w:t xml:space="preserve"> (même procédure qu'au § 5.2). Il remplace l'application ; </w:t>
-      </w:r>
-      <w:r>
-        <w:rPr>
-          <w:b/>
-        </w:rPr>
-        <w:t>la base n'est pas touchée</w:t>
-      </w:r>
-      <w:r>
-        <w:t xml:space="preserve"> par l'installateur.</w:t>
-      </w:r>
-    </w:p>
-    <w:p>
-      <w:pPr>
-        <w:pStyle w:val="ListNumber"/>
-        <w:numPr>
-          <w:ilvl w:val="0"/>
-          <w:numId w:val="17"/>
-        </w:numPr>
-        <w:spacing w:after="40"/>
-      </w:pPr>
-      <w:r>
-        <w:t>L'application démarre : elle sauvegarde la base (« Avant une mise à jour »), puis applique les migrations.</w:t>
-      </w:r>
-    </w:p>
-    <w:p>
-      <w:pPr>
-        <w:pStyle w:val="ListNumber"/>
-        <w:numPr>
-          <w:ilvl w:val="0"/>
-          <w:numId w:val="17"/>
-        </w:numPr>
-        <w:spacing w:after="40"/>
-      </w:pPr>
-      <w:r>
-        <w:t>Vérifications :</w:t>
-      </w:r>
-    </w:p>
-    <w:p>
-      <w:pPr>
-        <w:pStyle w:val="ListBullet2"/>
-        <w:spacing w:after="40"/>
-      </w:pPr>
-      <w:r>
-        <w:t>☐ connexion de l'administratrice ;</w:t>
-      </w:r>
-    </w:p>
-    <w:p>
-      <w:pPr>
-        <w:pStyle w:val="ListBullet2"/>
-        <w:spacing w:after="40"/>
-      </w:pPr>
-      <w:r>
-        <w:t>☐ écran Sauvegardes : une sauvegarde « Avant une mise à jour » toute récente ;</w:t>
-      </w:r>
-    </w:p>
-    <w:p>
-      <w:pPr>
-        <w:pStyle w:val="ListBullet2"/>
-        <w:spacing w:after="40"/>
-      </w:pPr>
-      <w:r>
-        <w:t>☐ Stock : même valeur totale qu'avant la mise à jour ;</w:t>
-      </w:r>
-    </w:p>
-    <w:p>
-      <w:pPr>
-        <w:pStyle w:val="ListBullet2"/>
-        <w:spacing w:after="40"/>
-      </w:pPr>
-      <w:r>
-        <w:t>☐ Fournisseurs : même total dû ;</w:t>
-      </w:r>
-    </w:p>
-    <w:p>
-      <w:pPr>
-        <w:pStyle w:val="ListBullet2"/>
-        <w:spacing w:after="40"/>
-      </w:pPr>
-      <w:r>
-        <w:t>☐ Réglages matériel : ticket de test imprimé ;</w:t>
-      </w:r>
-    </w:p>
-    <w:p>
-      <w:pPr>
-        <w:pStyle w:val="ListBullet2"/>
-        <w:spacing w:after="40"/>
-      </w:pPr>
-      <w:r>
-        <w:t>☐ les nouveautés de la version, montrées à la cliente.</w:t>
-      </w:r>
-    </w:p>
-    <w:p>
-      <w:pPr>
-        <w:pStyle w:val="ListNumber"/>
-        <w:numPr>
-          <w:ilvl w:val="0"/>
-          <w:numId w:val="17"/>
-        </w:numPr>
-        <w:spacing w:after="40"/>
-      </w:pPr>
-      <w:r>
-        <w:t>Noter la mise à jour sur la fiche de suivi (annexe B).</w:t>
-      </w:r>
-    </w:p>
-    <w:p>
-      <w:pPr>
-        <w:pStyle w:val="Heading2"/>
-      </w:pPr>
-      <w:r>
-        <w:t>6.4 Mise à jour sans migration</w:t>
-      </w:r>
-    </w:p>
-    <w:p>
-      <w:r>
-        <w:t>Même procédure (étapes 1 à 8). Il n'y aura simplement pas de sauvegarde « Avant une mise à jour » à l'étape 6 : c'est normal.</w:t>
-      </w:r>
-    </w:p>
-    <w:p>
-      <w:pPr>
-        <w:pStyle w:val="Heading1"/>
-      </w:pPr>
-      <w:r>
-        <w:t>7. Retour arrière (si la mise à jour se passe mal)</w:t>
-      </w:r>
-    </w:p>
-    <w:p>
-      <w:pPr>
-        <w:pStyle w:val="Heading2"/>
-      </w:pPr>
-      <w:r>
-        <w:t>7.1 L'application ne démarre plus après la mise à jour</w:t>
-      </w:r>
-    </w:p>
-    <w:p>
-      <w:r>
-        <w:t>Message « Démarrage impossible » : la migration en échec a été annulée (tout ou rien), mais celles qui la précédaient dans la même mise à jour sont restées appliquées. On revient donc à la base d'avant la mise à jour :</w:t>
-      </w:r>
-    </w:p>
-    <w:p>
-      <w:pPr>
-        <w:pStyle w:val="ListNumber"/>
-        <w:numPr>
-          <w:ilvl w:val="0"/>
-          <w:numId w:val="18"/>
-        </w:numPr>
-        <w:spacing w:after="40"/>
-      </w:pPr>
-      <w:r>
-        <w:t>Noter le message exact (photo) et le transmettre aux développeurs.</w:t>
-      </w:r>
-    </w:p>
-    <w:p>
-      <w:pPr>
-        <w:pStyle w:val="ListNumber"/>
-        <w:numPr>
-          <w:ilvl w:val="0"/>
-          <w:numId w:val="18"/>
-        </w:numPr>
-        <w:spacing w:after="40"/>
-      </w:pPr>
-      <w:r>
-        <w:t xml:space="preserve">Réinstaller </w:t>
-      </w:r>
-      <w:r>
-        <w:rPr>
-          <w:b/>
-        </w:rPr>
-        <w:t>la version précédente</w:t>
-      </w:r>
-      <w:r>
-        <w:t xml:space="preserve"> (</w:t>
-      </w:r>
-      <w:r>
-        <w:rPr>
-          <w:rFonts w:ascii="Consolas" w:hAnsi="Consolas"/>
-          <w:color w:val="13294B"/>
-          <w:sz w:val="18"/>
-        </w:rPr>
-        <w:t>Setup 1.0.0.exe</w:t>
-      </w:r>
-      <w:r>
-        <w:t>, gardé sur la clé).</w:t>
-      </w:r>
-    </w:p>
-    <w:p>
-      <w:pPr>
-        <w:pStyle w:val="ListNumber"/>
-        <w:numPr>
-          <w:ilvl w:val="0"/>
-          <w:numId w:val="18"/>
-        </w:numPr>
-        <w:spacing w:after="40"/>
-      </w:pPr>
-      <w:r>
-        <w:t xml:space="preserve">Remettre la base d'avant la mise à jour par la </w:t>
-      </w:r>
-      <w:r>
-        <w:rPr>
-          <w:b/>
-        </w:rPr>
-        <w:t>restauration manuelle</w:t>
-      </w:r>
-      <w:r>
-        <w:t xml:space="preserve"> (§ 7.3), avec la sauvegarde « Avant une mise à jour » (ou la copie de l'étape 4 du § 6.3).</w:t>
-      </w:r>
-    </w:p>
-    <w:p>
-      <w:pPr>
-        <w:pStyle w:val="ListNumber"/>
-        <w:numPr>
-          <w:ilvl w:val="0"/>
-          <w:numId w:val="18"/>
-        </w:numPr>
-        <w:spacing w:after="40"/>
-      </w:pPr>
-      <w:r>
-        <w:t>La boutique peut revendre. Les développeurs corrigent la migration, refont la répétition générale (§ 6.2), puis une nouvelle mise à jour.</w:t>
-      </w:r>
-    </w:p>
-    <w:p>
-      <w:pPr>
-        <w:pStyle w:val="Heading2"/>
-      </w:pPr>
-      <w:r>
-        <w:t>7.2 L'application démarre mais les données semblent fausses</w:t>
+        <w:t>).</w:t>
       </w:r>
     </w:p>
     <w:p>
@@ -3884,13 +4069,51 @@
         <w:spacing w:after="40"/>
       </w:pPr>
       <w:r>
+        <w:t xml:space="preserve">Renommer </w:t>
+      </w:r>
+      <w:r>
         <w:rPr>
-          <w:b/>
+          <w:rFonts w:ascii="Consolas" w:hAnsi="Consolas"/>
+          <w:color w:val="13294B"/>
+          <w:sz w:val="18"/>
         </w:rPr>
-        <w:t>Arrêter tout de suite</w:t>
-      </w:r>
-      <w:r>
-        <w:t xml:space="preserve"> de vendre sur cette version.</w:t>
+        <w:t>boutique.db</w:t>
+      </w:r>
+      <w:r>
+        <w:t xml:space="preserve"> en </w:t>
+      </w:r>
+      <w:r>
+        <w:rPr>
+          <w:rFonts w:ascii="Consolas" w:hAnsi="Consolas"/>
+          <w:color w:val="13294B"/>
+          <w:sz w:val="18"/>
+        </w:rPr>
+        <w:t>boutique_HS_AAAA-MM-JJ.db</w:t>
+      </w:r>
+      <w:r>
+        <w:t xml:space="preserve"> (ne rien effacer), ainsi que </w:t>
+      </w:r>
+      <w:r>
+        <w:rPr>
+          <w:rFonts w:ascii="Consolas" w:hAnsi="Consolas"/>
+          <w:color w:val="13294B"/>
+          <w:sz w:val="18"/>
+        </w:rPr>
+        <w:t>boutique.db-wal</w:t>
+      </w:r>
+      <w:r>
+        <w:t xml:space="preserve"> et </w:t>
+      </w:r>
+      <w:r>
+        <w:rPr>
+          <w:rFonts w:ascii="Consolas" w:hAnsi="Consolas"/>
+          <w:color w:val="13294B"/>
+          <w:sz w:val="18"/>
+        </w:rPr>
+        <w:t>boutique.db-shm</w:t>
+      </w:r>
+      <w:r>
+        <w:t xml:space="preserve"> s'ils existent.</w:t>
       </w:r>
     </w:p>
     <w:p>
@@ -3903,7 +4126,40 @@
         <w:spacing w:after="40"/>
       </w:pPr>
       <w:r>
-        <w:t>Réinstaller la version précédente.</w:t>
+        <w:t xml:space="preserve">Copier la sauvegarde choisie (dossier </w:t>
+      </w:r>
+      <w:r>
+        <w:rPr>
+          <w:rFonts w:ascii="Consolas" w:hAnsi="Consolas"/>
+          <w:color w:val="13294B"/>
+          <w:sz w:val="18"/>
+        </w:rPr>
+        <w:t>sauvegardes</w:t>
+      </w:r>
+      <w:r>
+        <w:t xml:space="preserve">, ex. </w:t>
+      </w:r>
+      <w:r>
+        <w:rPr>
+          <w:rFonts w:ascii="Consolas" w:hAnsi="Consolas"/>
+          <w:color w:val="13294B"/>
+          <w:sz w:val="18"/>
+        </w:rPr>
+        <w:t>boutique_AAAA-MM-JJ_HHMMSS_mise_a_jour.db</w:t>
+      </w:r>
+      <w:r>
+        <w:t xml:space="preserve">) dans le dossier de données, et la renommer </w:t>
+      </w:r>
+      <w:r>
+        <w:rPr>
+          <w:rFonts w:ascii="Consolas" w:hAnsi="Consolas"/>
+          <w:color w:val="13294B"/>
+          <w:sz w:val="18"/>
+        </w:rPr>
+        <w:t>boutique.db</w:t>
+      </w:r>
+      <w:r>
+        <w:t>.</w:t>
       </w:r>
     </w:p>
     <w:p>
@@ -3916,30 +4172,15 @@
         <w:spacing w:after="40"/>
       </w:pPr>
       <w:r>
-        <w:t xml:space="preserve">Restaurer la sauvegarde « Avant une mise à jour » (§ 8.2) : elle date d'avant les migrations, donc l'ancienne version l'accepte. </w:t>
-      </w:r>
-      <w:r>
-        <w:rPr>
-          <w:b/>
-        </w:rPr>
-        <w:t>Tout ce qui a été saisi après la mise à jour est perdu</w:t>
-      </w:r>
-      <w:r>
-        <w:t xml:space="preserve"> : c'est pourquoi les vérifications du § 6.3 se font avant de rouvrir la caisse.</w:t>
+        <w:t>Lancer l'application et vérifier comme au § 6.3, étape 7.</w:t>
       </w:r>
     </w:p>
     <w:p>
-      <w:r>
-        <w:t xml:space="preserve">Une sauvegarde faite par une version </w:t>
-      </w:r>
-      <w:r>
-        <w:rPr>
-          <w:b/>
-        </w:rPr>
-        <w:t>plus récente</w:t>
-      </w:r>
-      <w:r>
-        <w:t xml:space="preserve"> est refusée par une version plus ancienne (migration inconnue) : c'est voulu, pour ne jamais ouvrir une base avec un code qui ne la comprend pas.</w:t>
+      <w:pPr>
+        <w:pStyle w:val="Heading1"/>
+      </w:pPr>
+      <w:r>
+        <w:t>8. Sauvegardes et reprise après panne</w:t>
       </w:r>
     </w:p>
     <w:p>
@@ -3947,7 +4188,42 @@
         <w:pStyle w:val="Heading2"/>
       </w:pPr>
       <w:r>
-        <w:t>7.3 Restauration manuelle (quand l'application ne démarre pas)</w:t>
+        <w:t>8.1 Au quotidien (la cliente)</w:t>
+      </w:r>
+    </w:p>
+    <w:p>
+      <w:pPr>
+        <w:pStyle w:val="ListBullet"/>
+        <w:spacing w:after="40"/>
+      </w:pPr>
+      <w:r>
+        <w:t>Une sauvegarde à chaque clôture de caisse, sur le terminal et sur la clé USB.</w:t>
+      </w:r>
+    </w:p>
+    <w:p>
+      <w:pPr>
+        <w:pStyle w:val="ListBullet"/>
+        <w:spacing w:after="40"/>
+      </w:pPr>
+      <w:r>
+        <w:t>Écran Sauvegardes : vérifier de temps en temps la date de la dernière ; une alerte apparaît si elle a plus de 2 jours.</w:t>
+      </w:r>
+    </w:p>
+    <w:p>
+      <w:pPr>
+        <w:pStyle w:val="ListBullet"/>
+        <w:spacing w:after="40"/>
+      </w:pPr>
+      <w:r>
+        <w:t>Emporter la clé hors de la boutique une fois par semaine, la rebrancher le lendemain.</w:t>
+      </w:r>
+    </w:p>
+    <w:p>
+      <w:pPr>
+        <w:pStyle w:val="Heading2"/>
+      </w:pPr>
+      <w:r>
+        <w:t>8.2 Restaurer une sauvegarde (administratrice)</w:t>
       </w:r>
     </w:p>
     <w:p>
@@ -3960,7 +4236,16 @@
         <w:spacing w:after="40"/>
       </w:pPr>
       <w:r>
-        <w:t>Fermer l'application (vérifier dans le Gestionnaire des tâches qu'elle ne tourne plus).</w:t>
+        <w:t xml:space="preserve">Écran </w:t>
+      </w:r>
+      <w:r>
+        <w:rPr>
+          <w:b/>
+        </w:rPr>
+        <w:t>Sauvegardes</w:t>
+      </w:r>
+      <w:r>
+        <w:t xml:space="preserve"> : « Restaurer » sur une sauvegarde de la liste, ou « Restaurer depuis un fichier » pour une sauvegarde de la clé USB.</w:t>
       </w:r>
     </w:p>
     <w:p>
@@ -3973,18 +4258,7 @@
         <w:spacing w:after="40"/>
       </w:pPr>
       <w:r>
-        <w:t>Ouvrir le dossier de données (</w:t>
-      </w:r>
-      <w:r>
-        <w:rPr>
-          <w:rFonts w:ascii="Consolas" w:hAnsi="Consolas"/>
-          <w:color w:val="13294B"/>
-          <w:sz w:val="18"/>
-        </w:rPr>
-        <w:t>%APPDATA%\&lt;dossier&gt;</w:t>
-      </w:r>
-      <w:r>
-        <w:t>).</w:t>
+        <w:t>Lire l'avertissement, cocher « J'ai compris », valider.</w:t>
       </w:r>
     </w:p>
     <w:p>
@@ -3997,7 +4271,21 @@
         <w:spacing w:after="40"/>
       </w:pPr>
       <w:r>
-        <w:t xml:space="preserve">Renommer </w:t>
+        <w:t>L'application sauvegarde d'abord la base en place (« Avant une restauration »), la remplace, puis redémarre. Chacun se reconnecte.</w:t>
+      </w:r>
+    </w:p>
+    <w:p>
+      <w:r>
+        <w:t xml:space="preserve">Avant la mise en service, cette restauration se répète sur le terminal, </w:t>
+      </w:r>
+      <w:r>
+        <w:rPr>
+          <w:b/>
+        </w:rPr>
+        <w:t>sur une copie</w:t>
+      </w:r>
+      <w:r>
+        <w:t xml:space="preserve"> de la base, avec </w:t>
       </w:r>
       <w:r>
         <w:rPr>
@@ -4005,10 +4293,10 @@
           <w:color w:val="13294B"/>
           <w:sz w:val="18"/>
         </w:rPr>
-        <w:t>boutique.db</w:t>
-      </w:r>
-      <w:r>
-        <w:t xml:space="preserve"> en </w:t>
+        <w:t>docs/fiches-test/ESSAI_RESTAURATION.md</w:t>
+      </w:r>
+      <w:r>
+        <w:t xml:space="preserve"> (script </w:t>
       </w:r>
       <w:r>
         <w:rPr>
@@ -4016,142 +4304,18 @@
           <w:color w:val="13294B"/>
           <w:sz w:val="18"/>
         </w:rPr>
-        <w:t>boutique_HS_AAAA-MM-JJ.db</w:t>
-      </w:r>
-      <w:r>
-        <w:t xml:space="preserve"> (ne rien effacer), ainsi que </w:t>
-      </w:r>
-      <w:r>
-        <w:rPr>
-          <w:rFonts w:ascii="Consolas" w:hAnsi="Consolas"/>
-          <w:color w:val="13294B"/>
-          <w:sz w:val="18"/>
-        </w:rPr>
-        <w:t>boutique.db-wal</w:t>
-      </w:r>
-      <w:r>
-        <w:t xml:space="preserve"> et </w:t>
-      </w:r>
-      <w:r>
-        <w:rPr>
-          <w:rFonts w:ascii="Consolas" w:hAnsi="Consolas"/>
-          <w:color w:val="13294B"/>
-          <w:sz w:val="18"/>
-        </w:rPr>
-        <w:t>boutique.db-shm</w:t>
-      </w:r>
-      <w:r>
-        <w:t xml:space="preserve"> s'ils existent.</w:t>
+        <w:t>scripts/lancer-essai-restauration.cmd</w:t>
+      </w:r>
+      <w:r>
+        <w:t>).</w:t>
       </w:r>
     </w:p>
     <w:p>
       <w:pPr>
-        <w:pStyle w:val="ListNumber"/>
-        <w:numPr>
-          <w:ilvl w:val="0"/>
-          <w:numId w:val="20"/>
-        </w:numPr>
-        <w:spacing w:after="40"/>
-      </w:pPr>
-      <w:r>
-        <w:t xml:space="preserve">Copier la sauvegarde choisie (dossier </w:t>
-      </w:r>
-      <w:r>
-        <w:rPr>
-          <w:rFonts w:ascii="Consolas" w:hAnsi="Consolas"/>
-          <w:color w:val="13294B"/>
-          <w:sz w:val="18"/>
-        </w:rPr>
-        <w:t>sauvegardes</w:t>
-      </w:r>
-      <w:r>
-        <w:t xml:space="preserve">, ex. </w:t>
-      </w:r>
-      <w:r>
-        <w:rPr>
-          <w:rFonts w:ascii="Consolas" w:hAnsi="Consolas"/>
-          <w:color w:val="13294B"/>
-          <w:sz w:val="18"/>
-        </w:rPr>
-        <w:t>boutique_AAAA-MM-JJ_HHMMSS_mise_a_jour.db</w:t>
-      </w:r>
-      <w:r>
-        <w:t xml:space="preserve">) dans le dossier de données, et la renommer </w:t>
-      </w:r>
-      <w:r>
-        <w:rPr>
-          <w:rFonts w:ascii="Consolas" w:hAnsi="Consolas"/>
-          <w:color w:val="13294B"/>
-          <w:sz w:val="18"/>
-        </w:rPr>
-        <w:t>boutique.db</w:t>
-      </w:r>
-      <w:r>
-        <w:t>.</w:t>
-      </w:r>
-    </w:p>
-    <w:p>
-      <w:pPr>
-        <w:pStyle w:val="ListNumber"/>
-        <w:numPr>
-          <w:ilvl w:val="0"/>
-          <w:numId w:val="20"/>
-        </w:numPr>
-        <w:spacing w:after="40"/>
-      </w:pPr>
-      <w:r>
-        <w:t>Lancer l'application et vérifier comme au § 6.3, étape 7.</w:t>
-      </w:r>
-    </w:p>
-    <w:p>
-      <w:pPr>
-        <w:pStyle w:val="Heading1"/>
-      </w:pPr>
-      <w:r>
-        <w:t>8. Sauvegardes et reprise après panne</w:t>
-      </w:r>
-    </w:p>
-    <w:p>
-      <w:pPr>
         <w:pStyle w:val="Heading2"/>
       </w:pPr>
       <w:r>
-        <w:t>8.1 Au quotidien (la cliente)</w:t>
-      </w:r>
-    </w:p>
-    <w:p>
-      <w:pPr>
-        <w:pStyle w:val="ListBullet"/>
-        <w:spacing w:after="40"/>
-      </w:pPr>
-      <w:r>
-        <w:t>Une sauvegarde à chaque clôture de caisse, sur le terminal et sur la clé USB.</w:t>
-      </w:r>
-    </w:p>
-    <w:p>
-      <w:pPr>
-        <w:pStyle w:val="ListBullet"/>
-        <w:spacing w:after="40"/>
-      </w:pPr>
-      <w:r>
-        <w:t>Écran Sauvegardes : vérifier de temps en temps la date de la dernière ; une alerte apparaît si elle a plus de 2 jours.</w:t>
-      </w:r>
-    </w:p>
-    <w:p>
-      <w:pPr>
-        <w:pStyle w:val="ListBullet"/>
-        <w:spacing w:after="40"/>
-      </w:pPr>
-      <w:r>
-        <w:t>Emporter la clé hors de la boutique une fois par semaine, la rebrancher le lendemain.</w:t>
-      </w:r>
-    </w:p>
-    <w:p>
-      <w:pPr>
-        <w:pStyle w:val="Heading2"/>
-      </w:pPr>
-      <w:r>
-        <w:t>8.2 Restaurer une sauvegarde (administratrice)</w:t>
+        <w:t>8.3 Le terminal est en panne (disque, vol)</w:t>
       </w:r>
     </w:p>
     <w:p>
@@ -4164,16 +4328,16 @@
         <w:spacing w:after="40"/>
       </w:pPr>
       <w:r>
-        <w:t xml:space="preserve">Écran </w:t>
+        <w:t xml:space="preserve">Préparer un nouveau poste Windows (§ 4) avec le </w:t>
       </w:r>
       <w:r>
         <w:rPr>
           <w:b/>
         </w:rPr>
-        <w:t>Sauvegardes</w:t>
-      </w:r>
-      <w:r>
-        <w:t xml:space="preserve"> : « Restaurer » sur une sauvegarde de la liste, ou « Restaurer depuis un fichier » pour une sauvegarde de la clé USB.</w:t>
+        <w:t>même compte Windows dédié</w:t>
+      </w:r>
+      <w:r>
+        <w:t>.</w:t>
       </w:r>
     </w:p>
     <w:p>
@@ -4186,7 +4350,16 @@
         <w:spacing w:after="40"/>
       </w:pPr>
       <w:r>
-        <w:t>Lire l'avertissement, cocher « J'ai compris », valider.</w:t>
+        <w:t xml:space="preserve">Installer </w:t>
+      </w:r>
+      <w:r>
+        <w:rPr>
+          <w:b/>
+        </w:rPr>
+        <w:t>la même version</w:t>
+      </w:r>
+      <w:r>
+        <w:t xml:space="preserve"> que celle du terminal (fiche de suivi, annexe B).</w:t>
       </w:r>
     </w:p>
     <w:p>
@@ -4199,107 +4372,6 @@
         <w:spacing w:after="40"/>
       </w:pPr>
       <w:r>
-        <w:t>L'application sauvegarde d'abord la base en place (« Avant une restauration »), la remplace, puis redémarre. Chacun se reconnecte.</w:t>
-      </w:r>
-    </w:p>
-    <w:p>
-      <w:r>
-        <w:t xml:space="preserve">Avant la mise en service, cette restauration se répète sur le terminal, </w:t>
-      </w:r>
-      <w:r>
-        <w:rPr>
-          <w:b/>
-        </w:rPr>
-        <w:t>sur une copie</w:t>
-      </w:r>
-      <w:r>
-        <w:t xml:space="preserve"> de la base, avec </w:t>
-      </w:r>
-      <w:r>
-        <w:rPr>
-          <w:rFonts w:ascii="Consolas" w:hAnsi="Consolas"/>
-          <w:color w:val="13294B"/>
-          <w:sz w:val="18"/>
-        </w:rPr>
-        <w:t>docs/fiches-test/ESSAI_RESTAURATION.md</w:t>
-      </w:r>
-      <w:r>
-        <w:t xml:space="preserve"> (script </w:t>
-      </w:r>
-      <w:r>
-        <w:rPr>
-          <w:rFonts w:ascii="Consolas" w:hAnsi="Consolas"/>
-          <w:color w:val="13294B"/>
-          <w:sz w:val="18"/>
-        </w:rPr>
-        <w:t>scripts/lancer-essai-restauration.cmd</w:t>
-      </w:r>
-      <w:r>
-        <w:t>).</w:t>
-      </w:r>
-    </w:p>
-    <w:p>
-      <w:pPr>
-        <w:pStyle w:val="Heading2"/>
-      </w:pPr>
-      <w:r>
-        <w:t>8.3 Le terminal est en panne (disque, vol)</w:t>
-      </w:r>
-    </w:p>
-    <w:p>
-      <w:pPr>
-        <w:pStyle w:val="ListNumber"/>
-        <w:numPr>
-          <w:ilvl w:val="0"/>
-          <w:numId w:val="22"/>
-        </w:numPr>
-        <w:spacing w:after="40"/>
-      </w:pPr>
-      <w:r>
-        <w:t xml:space="preserve">Préparer un nouveau poste Windows (§ 4) avec le </w:t>
-      </w:r>
-      <w:r>
-        <w:rPr>
-          <w:b/>
-        </w:rPr>
-        <w:t>même compte Windows dédié</w:t>
-      </w:r>
-      <w:r>
-        <w:t>.</w:t>
-      </w:r>
-    </w:p>
-    <w:p>
-      <w:pPr>
-        <w:pStyle w:val="ListNumber"/>
-        <w:numPr>
-          <w:ilvl w:val="0"/>
-          <w:numId w:val="22"/>
-        </w:numPr>
-        <w:spacing w:after="40"/>
-      </w:pPr>
-      <w:r>
-        <w:t xml:space="preserve">Installer </w:t>
-      </w:r>
-      <w:r>
-        <w:rPr>
-          <w:b/>
-        </w:rPr>
-        <w:t>la même version</w:t>
-      </w:r>
-      <w:r>
-        <w:t xml:space="preserve"> que celle du terminal (fiche de suivi, annexe B).</w:t>
-      </w:r>
-    </w:p>
-    <w:p>
-      <w:pPr>
-        <w:pStyle w:val="ListNumber"/>
-        <w:numPr>
-          <w:ilvl w:val="0"/>
-          <w:numId w:val="22"/>
-        </w:numPr>
-        <w:spacing w:after="40"/>
-      </w:pPr>
-      <w:r>
         <w:t xml:space="preserve">Au premier démarrage, l'assistant demande un compte administrateur : en créer un </w:t>
       </w:r>
       <w:r>
@@ -4317,7 +4389,7 @@
         <w:pStyle w:val="ListNumber"/>
         <w:numPr>
           <w:ilvl w:val="0"/>
-          <w:numId w:val="22"/>
+          <w:numId w:val="21"/>
         </w:numPr>
         <w:spacing w:after="40"/>
       </w:pPr>
@@ -4339,7 +4411,7 @@
         <w:pStyle w:val="ListNumber"/>
         <w:numPr>
           <w:ilvl w:val="0"/>
-          <w:numId w:val="22"/>
+          <w:numId w:val="21"/>
         </w:numPr>
         <w:spacing w:after="40"/>
       </w:pPr>
@@ -5241,7 +5313,7 @@
       <w:rPr>
         <w:sz w:val="16"/>
       </w:rPr>
-      <w:t xml:space="preserve">Procédure de déploiement — Ma Boutique POS — page </w:t>
+      <w:t xml:space="preserve">Procédure de déploiement sur le terminal de la boutique — page </w:t>
     </w:r>
     <w:r>
       <w:rPr>
@@ -5522,12 +5594,6 @@
     </w:lvlOverride>
   </w:num>
   <w:num w:numId="21">
-    <w:abstractNumId w:val="7"/>
-    <w:lvlOverride w:ilvl="0">
-      <w:startOverride w:val="1"/>
-    </w:lvlOverride>
-  </w:num>
-  <w:num w:numId="22">
     <w:abstractNumId w:val="7"/>
     <w:lvlOverride w:ilvl="0">
       <w:startOverride w:val="1"/>

</xml_diff>